<commit_message>
Canva nagekeken met het leerlingaccount: echte knopnamen, leeg ontwerp, schermafbeeldingen en filmpje Splitsen
Co-Authored-By: Claude Opus 5.5 <noreply@anthropic.com>
</commit_message>
<xml_diff>
--- a/werkdocument/Montagelogboek.docx
+++ b/werkdocument/Montagelogboek.docx
@@ -798,7 +798,7 @@
                 <w:color w:val="2A3973"/>
                 <w:sz w:val="22"/>
               </w:rPr>
-              <w:t>Kan bekijken</w:t>
+              <w:t>Mag bekijken</w:t>
             </w:r>
           </w:p>
         </w:tc>
@@ -819,7 +819,7 @@
                 <w:color w:val="2A3973"/>
                 <w:sz w:val="22"/>
               </w:rPr>
-              <w:t>Kan reageren</w:t>
+              <w:t>Kan reactie achterlaten</w:t>
             </w:r>
           </w:p>
         </w:tc>
@@ -840,7 +840,7 @@
                 <w:color w:val="2A3973"/>
                 <w:sz w:val="22"/>
               </w:rPr>
-              <w:t>Kan bewerken</w:t>
+              <w:t>Mag bewerken</w:t>
             </w:r>
           </w:p>
         </w:tc>
@@ -2056,7 +2056,7 @@
                 <w:b w:val="0"/>
                 <w:i w:val="0"/>
               </w:rPr>
-              <w:t>Deel 2: de link opent het ontwerp van de groep. Het ontwerp is gedeeld met de groepsgenoten en met de leraar, met Kan bewerken.</w:t>
+              <w:t>Deel 2: de link opent het ontwerp van de groep. Het ontwerp is gedeeld met de groepsgenoten en met de leraar, met Mag bewerken.</w:t>
             </w:r>
           </w:p>
         </w:tc>

</xml_diff>